<commit_message>
chore(legal): regenerar los .docx de los contratos modificados
Los .docx son la versión con membrete que se envía al cliente. Se regeneran
desde el Markdown ya corregido para que no queden con el precio viejo de Menús
ni sin la cláusula de soporte post-lanzamiento.

No incluye el de Software a Medida: su Markdown no cambió.

Co-Authored-By: Claude Opus 5 <noreply@anthropic.com>
</commit_message>
<xml_diff>
--- a/docs/legal/servicios/docx/01-contrato-invitaciones-digitales.docx
+++ b/docs/legal/servicios/docx/01-contrato-invitaciones-digitales.docx
@@ -2963,6 +2963,91 @@
           <w:i w:val="0"/>
         </w:rPr>
         <w:t>, como pena convencional única y total, en términos de la Cláusula Décima Cuarta.</w:t>
+      </w:r>
+    </w:p>
+    <w:p>
+      <w:pPr>
+        <w:jc w:val="both"/>
+      </w:pPr>
+      <w:r>
+        <w:rPr>
+          <w:rFonts w:ascii="Calibri" w:hAnsi="Calibri"/>
+          <w:b/>
+          <w:i w:val="0"/>
+        </w:rPr>
+        <w:t>Soporte post-lanzamiento.</w:t>
+      </w:r>
+      <w:r>
+        <w:rPr>
+          <w:rFonts w:ascii="Calibri" w:hAnsi="Calibri"/>
+          <w:b w:val="0"/>
+          <w:i w:val="0"/>
+        </w:rPr>
+        <w:t xml:space="preserve"> Adicionalmente a la garantía, el plan </w:t>
+      </w:r>
+      <w:r>
+        <w:rPr>
+          <w:rFonts w:ascii="Calibri" w:hAnsi="Calibri"/>
+          <w:b/>
+          <w:i w:val="0"/>
+        </w:rPr>
+        <w:t>Pro</w:t>
+      </w:r>
+      <w:r>
+        <w:rPr>
+          <w:rFonts w:ascii="Calibri" w:hAnsi="Calibri"/>
+          <w:b w:val="0"/>
+          <w:i w:val="0"/>
+        </w:rPr>
+        <w:t xml:space="preserve"> incluye </w:t>
+      </w:r>
+      <w:r>
+        <w:rPr>
+          <w:rFonts w:ascii="Calibri" w:hAnsi="Calibri"/>
+          <w:b/>
+          <w:i w:val="0"/>
+        </w:rPr>
+        <w:t>30 (treinta) días naturales</w:t>
+      </w:r>
+      <w:r>
+        <w:rPr>
+          <w:rFonts w:ascii="Calibri" w:hAnsi="Calibri"/>
+          <w:b w:val="0"/>
+          <w:i w:val="0"/>
+        </w:rPr>
+        <w:t xml:space="preserve"> y el plan </w:t>
+      </w:r>
+      <w:r>
+        <w:rPr>
+          <w:rFonts w:ascii="Calibri" w:hAnsi="Calibri"/>
+          <w:b/>
+          <w:i w:val="0"/>
+        </w:rPr>
+        <w:t>Premium</w:t>
+      </w:r>
+      <w:r>
+        <w:rPr>
+          <w:rFonts w:ascii="Calibri" w:hAnsi="Calibri"/>
+          <w:b w:val="0"/>
+          <w:i w:val="0"/>
+        </w:rPr>
+        <w:t xml:space="preserve"> </w:t>
+      </w:r>
+      <w:r>
+        <w:rPr>
+          <w:rFonts w:ascii="Calibri" w:hAnsi="Calibri"/>
+          <w:b/>
+          <w:i w:val="0"/>
+        </w:rPr>
+        <w:t>90 (noventa) días naturales</w:t>
+      </w:r>
+      <w:r>
+        <w:rPr>
+          <w:rFonts w:ascii="Calibri" w:hAnsi="Calibri"/>
+          <w:b w:val="0"/>
+          <w:i w:val="0"/>
+        </w:rPr>
+        <w:t xml:space="preserve"> de soporte post-lanzamiento, contados desde la publicación, para dudas de uso y ajustes menores, sin exceder en ningún caso la vigencia contratada. Se presta en horario laboral con respuesta dentro de las 24 horas hábiles siguientes. No comprende funcionalidad nueva ni el rediseño de la invitación.</w:t>
       </w:r>
     </w:p>
     <w:p>

</xml_diff>